<commit_message>
Align conditional style controls with their declared memberships
</commit_message>
<xml_diff>
--- a/tests/Lokad.OoxPdf.Tests/Cases/ConditionalTableStyles/explicit-compat15.docx
+++ b/tests/Lokad.OoxPdf.Tests/Cases/ConditionalTableStyles/explicit-compat15.docx
@@ -21,7 +21,7 @@
         <w:tc>
           <w:tcPr>
             <w:tcW w:w="1920" w:type="dxa"/>
-            <w:cnfStyle w:firstRow="1" w:lastRow="0" w:firstColumn="1" w:lastColumn="0" w:oddHBand="1" w:evenHBand="0" w:oddVBand="1" w:evenVBand="0" w:firstRowFirstColumn="1" w:firstRowLastColumn="0" w:lastRowFirstColumn="0" w:lastRowLastColumn="0"/>
+            <w:cnfStyle w:firstRow="1" w:lastRow="0" w:firstColumn="1" w:lastColumn="0" w:oddHBand="0" w:evenHBand="0" w:oddVBand="0" w:evenVBand="0" w:firstRowFirstColumn="1" w:firstRowLastColumn="0" w:lastRowFirstColumn="0" w:lastRowLastColumn="0"/>
           </w:tcPr>
           <w:p>
             <w:pPr>
@@ -39,7 +39,7 @@
         <w:tc>
           <w:tcPr>
             <w:tcW w:w="1920" w:type="dxa"/>
-            <w:cnfStyle w:firstRow="1" w:lastRow="0" w:firstColumn="0" w:lastColumn="0" w:oddHBand="1" w:evenHBand="0" w:oddVBand="0" w:evenVBand="1" w:firstRowFirstColumn="0" w:firstRowLastColumn="0" w:lastRowFirstColumn="0" w:lastRowLastColumn="0"/>
+            <w:cnfStyle w:firstRow="1" w:lastRow="0" w:firstColumn="0" w:lastColumn="0" w:oddHBand="0" w:evenHBand="0" w:oddVBand="1" w:evenVBand="0" w:firstRowFirstColumn="0" w:firstRowLastColumn="0" w:lastRowFirstColumn="0" w:lastRowLastColumn="0"/>
           </w:tcPr>
           <w:p>
             <w:pPr>
@@ -57,7 +57,7 @@
         <w:tc>
           <w:tcPr>
             <w:tcW w:w="1920" w:type="dxa"/>
-            <w:cnfStyle w:firstRow="1" w:lastRow="0" w:firstColumn="0" w:lastColumn="1" w:oddHBand="1" w:evenHBand="0" w:oddVBand="1" w:evenVBand="0" w:firstRowFirstColumn="0" w:firstRowLastColumn="1" w:lastRowFirstColumn="0" w:lastRowLastColumn="0"/>
+            <w:cnfStyle w:firstRow="1" w:lastRow="0" w:firstColumn="0" w:lastColumn="1" w:oddHBand="0" w:evenHBand="0" w:oddVBand="0" w:evenVBand="0" w:firstRowFirstColumn="0" w:firstRowLastColumn="1" w:lastRowFirstColumn="0" w:lastRowLastColumn="0"/>
           </w:tcPr>
           <w:p>
             <w:pPr>
@@ -80,7 +80,7 @@
         <w:tc>
           <w:tcPr>
             <w:tcW w:w="1920" w:type="dxa"/>
-            <w:cnfStyle w:firstRow="0" w:lastRow="0" w:firstColumn="1" w:lastColumn="0" w:oddHBand="0" w:evenHBand="1" w:oddVBand="1" w:evenVBand="0" w:firstRowFirstColumn="0" w:firstRowLastColumn="0" w:lastRowFirstColumn="0" w:lastRowLastColumn="0"/>
+            <w:cnfStyle w:firstRow="0" w:lastRow="0" w:firstColumn="1" w:lastColumn="0" w:oddHBand="1" w:evenHBand="0" w:oddVBand="0" w:evenVBand="0" w:firstRowFirstColumn="0" w:firstRowLastColumn="0" w:lastRowFirstColumn="0" w:lastRowLastColumn="0"/>
           </w:tcPr>
           <w:p>
             <w:pPr>
@@ -98,7 +98,7 @@
         <w:tc>
           <w:tcPr>
             <w:tcW w:w="1920" w:type="dxa"/>
-            <w:cnfStyle w:firstRow="0" w:lastRow="0" w:firstColumn="0" w:lastColumn="0" w:oddHBand="0" w:evenHBand="1" w:oddVBand="0" w:evenVBand="1" w:firstRowFirstColumn="0" w:firstRowLastColumn="0" w:lastRowFirstColumn="0" w:lastRowLastColumn="0"/>
+            <w:cnfStyle w:firstRow="0" w:lastRow="0" w:firstColumn="0" w:lastColumn="0" w:oddHBand="1" w:evenHBand="0" w:oddVBand="1" w:evenVBand="0" w:firstRowFirstColumn="0" w:firstRowLastColumn="0" w:lastRowFirstColumn="0" w:lastRowLastColumn="0"/>
           </w:tcPr>
           <w:p>
             <w:pPr>
@@ -116,7 +116,7 @@
         <w:tc>
           <w:tcPr>
             <w:tcW w:w="1920" w:type="dxa"/>
-            <w:cnfStyle w:firstRow="0" w:lastRow="0" w:firstColumn="0" w:lastColumn="1" w:oddHBand="0" w:evenHBand="1" w:oddVBand="1" w:evenVBand="0" w:firstRowFirstColumn="0" w:firstRowLastColumn="0" w:lastRowFirstColumn="0" w:lastRowLastColumn="0"/>
+            <w:cnfStyle w:firstRow="0" w:lastRow="0" w:firstColumn="0" w:lastColumn="1" w:oddHBand="1" w:evenHBand="0" w:oddVBand="0" w:evenVBand="0" w:firstRowFirstColumn="0" w:firstRowLastColumn="0" w:lastRowFirstColumn="0" w:lastRowLastColumn="0"/>
           </w:tcPr>
           <w:p>
             <w:pPr>
@@ -139,7 +139,7 @@
         <w:tc>
           <w:tcPr>
             <w:tcW w:w="1920" w:type="dxa"/>
-            <w:cnfStyle w:firstRow="0" w:lastRow="1" w:firstColumn="1" w:lastColumn="0" w:oddHBand="1" w:evenHBand="0" w:oddVBand="1" w:evenVBand="0" w:firstRowFirstColumn="0" w:firstRowLastColumn="0" w:lastRowFirstColumn="1" w:lastRowLastColumn="0"/>
+            <w:cnfStyle w:firstRow="0" w:lastRow="1" w:firstColumn="1" w:lastColumn="0" w:oddHBand="0" w:evenHBand="0" w:oddVBand="0" w:evenVBand="0" w:firstRowFirstColumn="0" w:firstRowLastColumn="0" w:lastRowFirstColumn="1" w:lastRowLastColumn="0"/>
           </w:tcPr>
           <w:p>
             <w:pPr>
@@ -157,7 +157,7 @@
         <w:tc>
           <w:tcPr>
             <w:tcW w:w="1920" w:type="dxa"/>
-            <w:cnfStyle w:firstRow="0" w:lastRow="1" w:firstColumn="0" w:lastColumn="0" w:oddHBand="1" w:evenHBand="0" w:oddVBand="0" w:evenVBand="1" w:firstRowFirstColumn="0" w:firstRowLastColumn="0" w:lastRowFirstColumn="0" w:lastRowLastColumn="0"/>
+            <w:cnfStyle w:firstRow="0" w:lastRow="1" w:firstColumn="0" w:lastColumn="0" w:oddHBand="0" w:evenHBand="0" w:oddVBand="1" w:evenVBand="0" w:firstRowFirstColumn="0" w:firstRowLastColumn="0" w:lastRowFirstColumn="0" w:lastRowLastColumn="0"/>
           </w:tcPr>
           <w:p>
             <w:pPr>
@@ -175,7 +175,7 @@
         <w:tc>
           <w:tcPr>
             <w:tcW w:w="1920" w:type="dxa"/>
-            <w:cnfStyle w:firstRow="0" w:lastRow="1" w:firstColumn="0" w:lastColumn="1" w:oddHBand="1" w:evenHBand="0" w:oddVBand="1" w:evenVBand="0" w:firstRowFirstColumn="0" w:firstRowLastColumn="0" w:lastRowFirstColumn="0" w:lastRowLastColumn="1"/>
+            <w:cnfStyle w:firstRow="0" w:lastRow="1" w:firstColumn="0" w:lastColumn="1" w:oddHBand="0" w:evenHBand="0" w:oddVBand="0" w:evenVBand="0" w:firstRowFirstColumn="0" w:firstRowLastColumn="0" w:lastRowFirstColumn="0" w:lastRowLastColumn="1"/>
           </w:tcPr>
           <w:p>
             <w:pPr>
@@ -212,7 +212,7 @@
         <w:tc>
           <w:tcPr>
             <w:tcW w:w="1920" w:type="dxa"/>
-            <w:cnfStyle w:firstRow="1" w:lastRow="0" w:firstColumn="1" w:lastColumn="0" w:oddHBand="1" w:evenHBand="0" w:oddVBand="1" w:evenVBand="0" w:firstRowFirstColumn="1" w:firstRowLastColumn="0" w:lastRowFirstColumn="0" w:lastRowLastColumn="0"/>
+            <w:cnfStyle w:firstRow="1" w:lastRow="0" w:firstColumn="1" w:lastColumn="0" w:oddHBand="0" w:evenHBand="0" w:oddVBand="0" w:evenVBand="0" w:firstRowFirstColumn="1" w:firstRowLastColumn="0" w:lastRowFirstColumn="0" w:lastRowLastColumn="0"/>
           </w:tcPr>
           <w:p>
             <w:pPr>
@@ -230,7 +230,7 @@
         <w:tc>
           <w:tcPr>
             <w:tcW w:w="1920" w:type="dxa"/>
-            <w:cnfStyle w:firstRow="1" w:lastRow="0" w:firstColumn="0" w:lastColumn="0" w:oddHBand="1" w:evenHBand="0" w:oddVBand="0" w:evenVBand="1" w:firstRowFirstColumn="0" w:firstRowLastColumn="0" w:lastRowFirstColumn="0" w:lastRowLastColumn="0"/>
+            <w:cnfStyle w:firstRow="1" w:lastRow="0" w:firstColumn="0" w:lastColumn="0" w:oddHBand="0" w:evenHBand="0" w:oddVBand="1" w:evenVBand="0" w:firstRowFirstColumn="0" w:firstRowLastColumn="0" w:lastRowFirstColumn="0" w:lastRowLastColumn="0"/>
           </w:tcPr>
           <w:p>
             <w:pPr>
@@ -248,7 +248,7 @@
         <w:tc>
           <w:tcPr>
             <w:tcW w:w="1920" w:type="dxa"/>
-            <w:cnfStyle w:firstRow="1" w:lastRow="0" w:firstColumn="0" w:lastColumn="1" w:oddHBand="1" w:evenHBand="0" w:oddVBand="1" w:evenVBand="0" w:firstRowFirstColumn="0" w:firstRowLastColumn="1" w:lastRowFirstColumn="0" w:lastRowLastColumn="0"/>
+            <w:cnfStyle w:firstRow="1" w:lastRow="0" w:firstColumn="0" w:lastColumn="1" w:oddHBand="0" w:evenHBand="0" w:oddVBand="0" w:evenVBand="0" w:firstRowFirstColumn="0" w:firstRowLastColumn="1" w:lastRowFirstColumn="0" w:lastRowLastColumn="0"/>
           </w:tcPr>
           <w:p>
             <w:pPr>
@@ -271,7 +271,7 @@
         <w:tc>
           <w:tcPr>
             <w:tcW w:w="1920" w:type="dxa"/>
-            <w:cnfStyle w:firstRow="0" w:lastRow="0" w:firstColumn="1" w:lastColumn="0" w:oddHBand="0" w:evenHBand="1" w:oddVBand="1" w:evenVBand="0" w:firstRowFirstColumn="0" w:firstRowLastColumn="0" w:lastRowFirstColumn="0" w:lastRowLastColumn="0"/>
+            <w:cnfStyle w:firstRow="0" w:lastRow="0" w:firstColumn="1" w:lastColumn="0" w:oddHBand="1" w:evenHBand="0" w:oddVBand="0" w:evenVBand="0" w:firstRowFirstColumn="0" w:firstRowLastColumn="0" w:lastRowFirstColumn="0" w:lastRowLastColumn="0"/>
           </w:tcPr>
           <w:p>
             <w:pPr>
@@ -289,7 +289,7 @@
         <w:tc>
           <w:tcPr>
             <w:tcW w:w="1920" w:type="dxa"/>
-            <w:cnfStyle w:firstRow="0" w:lastRow="0" w:firstColumn="0" w:lastColumn="0" w:oddHBand="0" w:evenHBand="1" w:oddVBand="0" w:evenVBand="1" w:firstRowFirstColumn="0" w:firstRowLastColumn="0" w:lastRowFirstColumn="0" w:lastRowLastColumn="0"/>
+            <w:cnfStyle w:firstRow="0" w:lastRow="0" w:firstColumn="0" w:lastColumn="0" w:oddHBand="1" w:evenHBand="0" w:oddVBand="1" w:evenVBand="0" w:firstRowFirstColumn="0" w:firstRowLastColumn="0" w:lastRowFirstColumn="0" w:lastRowLastColumn="0"/>
           </w:tcPr>
           <w:p>
             <w:pPr>
@@ -307,7 +307,7 @@
         <w:tc>
           <w:tcPr>
             <w:tcW w:w="1920" w:type="dxa"/>
-            <w:cnfStyle w:firstRow="0" w:lastRow="0" w:firstColumn="0" w:lastColumn="1" w:oddHBand="0" w:evenHBand="1" w:oddVBand="1" w:evenVBand="0" w:firstRowFirstColumn="0" w:firstRowLastColumn="0" w:lastRowFirstColumn="0" w:lastRowLastColumn="0"/>
+            <w:cnfStyle w:firstRow="0" w:lastRow="0" w:firstColumn="0" w:lastColumn="1" w:oddHBand="1" w:evenHBand="0" w:oddVBand="0" w:evenVBand="0" w:firstRowFirstColumn="0" w:firstRowLastColumn="0" w:lastRowFirstColumn="0" w:lastRowLastColumn="0"/>
           </w:tcPr>
           <w:p>
             <w:pPr>
@@ -330,7 +330,7 @@
         <w:tc>
           <w:tcPr>
             <w:tcW w:w="1920" w:type="dxa"/>
-            <w:cnfStyle w:firstRow="0" w:lastRow="1" w:firstColumn="1" w:lastColumn="0" w:oddHBand="1" w:evenHBand="0" w:oddVBand="1" w:evenVBand="0" w:firstRowFirstColumn="0" w:firstRowLastColumn="0" w:lastRowFirstColumn="1" w:lastRowLastColumn="0"/>
+            <w:cnfStyle w:firstRow="0" w:lastRow="1" w:firstColumn="1" w:lastColumn="0" w:oddHBand="0" w:evenHBand="0" w:oddVBand="0" w:evenVBand="0" w:firstRowFirstColumn="0" w:firstRowLastColumn="0" w:lastRowFirstColumn="1" w:lastRowLastColumn="0"/>
           </w:tcPr>
           <w:p>
             <w:pPr>
@@ -348,7 +348,7 @@
         <w:tc>
           <w:tcPr>
             <w:tcW w:w="1920" w:type="dxa"/>
-            <w:cnfStyle w:firstRow="0" w:lastRow="1" w:firstColumn="0" w:lastColumn="0" w:oddHBand="1" w:evenHBand="0" w:oddVBand="0" w:evenVBand="1" w:firstRowFirstColumn="0" w:firstRowLastColumn="0" w:lastRowFirstColumn="0" w:lastRowLastColumn="0"/>
+            <w:cnfStyle w:firstRow="0" w:lastRow="1" w:firstColumn="0" w:lastColumn="0" w:oddHBand="0" w:evenHBand="0" w:oddVBand="1" w:evenVBand="0" w:firstRowFirstColumn="0" w:firstRowLastColumn="0" w:lastRowFirstColumn="0" w:lastRowLastColumn="0"/>
           </w:tcPr>
           <w:p>
             <w:pPr>
@@ -366,7 +366,7 @@
         <w:tc>
           <w:tcPr>
             <w:tcW w:w="1920" w:type="dxa"/>
-            <w:cnfStyle w:firstRow="0" w:lastRow="1" w:firstColumn="0" w:lastColumn="1" w:oddHBand="1" w:evenHBand="0" w:oddVBand="1" w:evenVBand="0" w:firstRowFirstColumn="0" w:firstRowLastColumn="0" w:lastRowFirstColumn="0" w:lastRowLastColumn="1"/>
+            <w:cnfStyle w:firstRow="0" w:lastRow="1" w:firstColumn="0" w:lastColumn="1" w:oddHBand="0" w:evenHBand="0" w:oddVBand="0" w:evenVBand="0" w:firstRowFirstColumn="0" w:firstRowLastColumn="0" w:lastRowFirstColumn="0" w:lastRowLastColumn="1"/>
           </w:tcPr>
           <w:p>
             <w:pPr>

</xml_diff>